<commit_message>
Update battery specification documents
Refresh the Battery_Specification files in both DOCX and PDF formats to keep the subsystem documentation aligned with the latest battery specification updates.
</commit_message>
<xml_diff>
--- a/Subsystems/Battery/Specifications/Battery_Specification.docx
+++ b/Subsystems/Battery/Specifications/Battery_Specification.docx
@@ -16,6 +16,14 @@
       </w:pPr>
       <w:r>
         <w:t>Executive Summary</w:t>
+      </w:r>
+    </w:p>
+    <w:p>
+      <w:pPr>
+        <w:jc w:val="both"/>
+      </w:pPr>
+      <w:r>
+        <w:t>The following specifications outline a custom-designed LiFePO4 battery pack intended to serve as the primary power source for a Brushless DC Motor (BLDCM) system.</w:t>
       </w:r>
     </w:p>
     <w:tbl>
@@ -94,13 +102,7 @@
                   <w:rPr>
                     <w:rFonts w:ascii="Cambria Math" w:hAnsi="Cambria Math"/>
                   </w:rPr>
-                  <m:t>42Ah</m:t>
-                </m:r>
-                <m:r>
-                  <w:rPr>
-                    <w:rFonts w:ascii="Cambria Math" w:hAnsi="Cambria Math"/>
-                  </w:rPr>
-                  <m:t xml:space="preserve"> </m:t>
+                  <m:t>42Ah </m:t>
                 </m:r>
                 <m:d>
                   <m:dPr>
@@ -511,12 +513,31 @@
       </w:pPr>
       <m:oMathPara>
         <m:oMath>
-          <m:r>
-            <w:rPr>
-              <w:rFonts w:ascii="Cambria Math" w:hAnsi="Cambria Math"/>
-            </w:rPr>
-            <m:t>E_{req}</m:t>
-          </m:r>
+          <m:sSub>
+            <m:sSubPr>
+              <m:ctrlPr>
+                <w:rPr>
+                  <w:rFonts w:ascii="Cambria Math" w:hAnsi="Cambria Math"/>
+                </w:rPr>
+              </m:ctrlPr>
+            </m:sSubPr>
+            <m:e>
+              <m:r>
+                <w:rPr>
+                  <w:rFonts w:ascii="Cambria Math" w:hAnsi="Cambria Math"/>
+                </w:rPr>
+                <m:t>E</m:t>
+              </m:r>
+            </m:e>
+            <m:sub>
+              <m:r>
+                <w:rPr>
+                  <w:rFonts w:ascii="Cambria Math" w:hAnsi="Cambria Math"/>
+                </w:rPr>
+                <m:t>req</m:t>
+              </m:r>
+            </m:sub>
+          </m:sSub>
           <m:r>
             <w:rPr>
               <w:rFonts w:ascii="Cambria Math" w:hAnsi="Cambria Math"/>
@@ -544,58 +565,10 @@
                 <w:rPr>
                   <w:rFonts w:ascii="Cambria Math" w:hAnsi="Cambria Math"/>
                 </w:rPr>
-                <m:t>8</m:t>
-              </m:r>
-              <m:r>
-                <w:rPr>
-                  <w:rFonts w:ascii="Cambria Math" w:hAnsi="Cambria Math"/>
-                </w:rPr>
-                <m:t>0</m:t>
-              </m:r>
-              <m:r>
-                <w:rPr>
-                  <w:rFonts w:ascii="Cambria Math" w:hAnsi="Cambria Math"/>
-                </w:rPr>
-                <m:t>%</m:t>
+                <m:t>80</m:t>
               </m:r>
             </m:den>
           </m:f>
-          <m:r>
-            <w:rPr>
-              <w:rFonts w:ascii="Cambria Math" w:hAnsi="Cambria Math"/>
-            </w:rPr>
-            <m:t xml:space="preserve"> × </m:t>
-          </m:r>
-          <m:r>
-            <w:rPr>
-              <w:rFonts w:ascii="Cambria Math" w:hAnsi="Cambria Math"/>
-            </w:rPr>
-            <m:t>2</m:t>
-          </m:r>
-          <m:r>
-            <w:rPr>
-              <w:rFonts w:ascii="Cambria Math" w:hAnsi="Cambria Math"/>
-            </w:rPr>
-            <m:t>h≈</m:t>
-          </m:r>
-          <m:r>
-            <w:rPr>
-              <w:rFonts w:ascii="Cambria Math" w:hAnsi="Cambria Math"/>
-            </w:rPr>
-            <m:t>1</m:t>
-          </m:r>
-          <m:r>
-            <w:rPr>
-              <w:rFonts w:ascii="Cambria Math" w:hAnsi="Cambria Math"/>
-            </w:rPr>
-            <m:t>650</m:t>
-          </m:r>
-          <m:r>
-            <w:rPr>
-              <w:rFonts w:ascii="Cambria Math" w:hAnsi="Cambria Math"/>
-            </w:rPr>
-            <m:t xml:space="preserve"> Wh</m:t>
-          </m:r>
         </m:oMath>
       </m:oMathPara>
     </w:p>
@@ -630,14 +603,33 @@
             <w:rPr>
               <w:rFonts w:ascii="Cambria Math" w:eastAsiaTheme="minorEastAsia" w:hAnsi="Cambria Math"/>
             </w:rPr>
-            <m:t>Ah</m:t>
+            <m:t>A</m:t>
           </m:r>
-          <m:r>
-            <w:rPr>
-              <w:rFonts w:ascii="Cambria Math" w:eastAsiaTheme="minorEastAsia" w:hAnsi="Cambria Math"/>
-            </w:rPr>
-            <m:t>_{req}</m:t>
-          </m:r>
+          <m:sSub>
+            <m:sSubPr>
+              <m:ctrlPr>
+                <w:rPr>
+                  <w:rFonts w:ascii="Cambria Math" w:eastAsiaTheme="minorEastAsia" w:hAnsi="Cambria Math"/>
+                </w:rPr>
+              </m:ctrlPr>
+            </m:sSubPr>
+            <m:e>
+              <m:r>
+                <w:rPr>
+                  <w:rFonts w:ascii="Cambria Math" w:eastAsiaTheme="minorEastAsia" w:hAnsi="Cambria Math"/>
+                </w:rPr>
+                <m:t>h</m:t>
+              </m:r>
+            </m:e>
+            <m:sub>
+              <m:r>
+                <w:rPr>
+                  <w:rFonts w:ascii="Cambria Math" w:eastAsiaTheme="minorEastAsia" w:hAnsi="Cambria Math"/>
+                </w:rPr>
+                <m:t>req</m:t>
+              </m:r>
+            </m:sub>
+          </m:sSub>
           <m:r>
             <w:rPr>
               <w:rFonts w:ascii="Cambria Math" w:eastAsiaTheme="minorEastAsia" w:hAnsi="Cambria Math"/>
@@ -657,25 +649,7 @@
                 <w:rPr>
                   <w:rFonts w:ascii="Cambria Math" w:eastAsiaTheme="minorEastAsia" w:hAnsi="Cambria Math"/>
                 </w:rPr>
-                <m:t>1</m:t>
-              </m:r>
-              <m:r>
-                <w:rPr>
-                  <w:rFonts w:ascii="Cambria Math" w:eastAsiaTheme="minorEastAsia" w:hAnsi="Cambria Math"/>
-                </w:rPr>
-                <m:t>650</m:t>
-              </m:r>
-              <m:r>
-                <w:rPr>
-                  <w:rFonts w:ascii="Cambria Math" w:eastAsiaTheme="minorEastAsia" w:hAnsi="Cambria Math"/>
-                </w:rPr>
-                <m:t xml:space="preserve"> </m:t>
-              </m:r>
-              <m:r>
-                <w:rPr>
-                  <w:rFonts w:ascii="Cambria Math" w:eastAsiaTheme="minorEastAsia" w:hAnsi="Cambria Math"/>
-                </w:rPr>
-                <m:t>Wh</m:t>
+                <m:t>1650 Wh</m:t>
               </m:r>
             </m:num>
             <m:den>
@@ -683,13 +657,7 @@
                 <w:rPr>
                   <w:rFonts w:ascii="Cambria Math" w:eastAsiaTheme="minorEastAsia" w:hAnsi="Cambria Math"/>
                 </w:rPr>
-                <m:t>48</m:t>
-              </m:r>
-              <m:r>
-                <w:rPr>
-                  <w:rFonts w:ascii="Cambria Math" w:eastAsiaTheme="minorEastAsia" w:hAnsi="Cambria Math"/>
-                </w:rPr>
-                <m:t>V</m:t>
+                <m:t>48V</m:t>
               </m:r>
             </m:den>
           </m:f>
@@ -697,19 +665,7 @@
             <w:rPr>
               <w:rFonts w:ascii="Cambria Math" w:eastAsiaTheme="minorEastAsia" w:hAnsi="Cambria Math"/>
             </w:rPr>
-            <m:t>≈</m:t>
-          </m:r>
-          <m:r>
-            <w:rPr>
-              <w:rFonts w:ascii="Cambria Math" w:eastAsiaTheme="minorEastAsia" w:hAnsi="Cambria Math"/>
-            </w:rPr>
-            <m:t>34.38</m:t>
-          </m:r>
-          <m:r>
-            <w:rPr>
-              <w:rFonts w:ascii="Cambria Math" w:eastAsiaTheme="minorEastAsia" w:hAnsi="Cambria Math"/>
-            </w:rPr>
-            <m:t xml:space="preserve"> Ah</m:t>
+            <m:t>≈34.38 Ah</m:t>
           </m:r>
         </m:oMath>
       </m:oMathPara>
@@ -726,7 +682,6 @@
         <w:pStyle w:val="Heading1"/>
       </w:pPr>
       <w:r>
-        <w:lastRenderedPageBreak/>
         <w:t>Battery Design</w:t>
       </w:r>
     </w:p>
@@ -1013,7 +968,6 @@
               <m:ctrlPr>
                 <w:rPr>
                   <w:rFonts w:ascii="Cambria Math" w:hAnsi="Cambria Math"/>
-                  <w:i/>
                 </w:rPr>
               </m:ctrlPr>
             </m:sSubPr>
@@ -1045,7 +999,6 @@
               <m:ctrlPr>
                 <w:rPr>
                   <w:rFonts w:ascii="Cambria Math" w:hAnsi="Cambria Math"/>
-                  <w:i/>
                 </w:rPr>
               </m:ctrlPr>
             </m:fPr>
@@ -1055,7 +1008,6 @@
                   <m:ctrlPr>
                     <w:rPr>
                       <w:rFonts w:ascii="Cambria Math" w:hAnsi="Cambria Math"/>
-                      <w:i/>
                     </w:rPr>
                   </m:ctrlPr>
                 </m:sSubPr>
@@ -1089,7 +1041,6 @@
                   <m:ctrlPr>
                     <w:rPr>
                       <w:rFonts w:ascii="Cambria Math" w:hAnsi="Cambria Math"/>
-                      <w:i/>
                     </w:rPr>
                   </m:ctrlPr>
                 </m:sSubPr>
@@ -1173,13 +1124,7 @@
                 <w:rPr>
                   <w:rFonts w:ascii="Cambria Math" w:hAnsi="Cambria Math"/>
                 </w:rPr>
-                <m:t>34.38</m:t>
-              </m:r>
-              <m:r>
-                <w:rPr>
-                  <w:rFonts w:ascii="Cambria Math" w:hAnsi="Cambria Math"/>
-                </w:rPr>
-                <m:t xml:space="preserve"> Ah</m:t>
+                <m:t>34.38 Ah</m:t>
               </m:r>
             </m:num>
             <m:den>
@@ -1193,21 +1138,9 @@
           </m:f>
           <m:r>
             <w:rPr>
-              <w:rFonts w:ascii="Cambria Math" w:eastAsiaTheme="minorEastAsia" w:hAnsi="Cambria Math"/>
+              <w:rFonts w:ascii="Cambria Math" w:hAnsi="Cambria Math"/>
             </w:rPr>
-            <m:t>=38.</m:t>
-          </m:r>
-          <m:r>
-            <w:rPr>
-              <w:rFonts w:ascii="Cambria Math" w:eastAsiaTheme="minorEastAsia" w:hAnsi="Cambria Math"/>
-            </w:rPr>
-            <m:t>2</m:t>
-          </m:r>
-          <m:r>
-            <w:rPr>
-              <w:rFonts w:ascii="Cambria Math" w:eastAsiaTheme="minorEastAsia" w:hAnsi="Cambria Math"/>
-            </w:rPr>
-            <m:t xml:space="preserve"> Ah</m:t>
+            <m:t>=38.2 Ah</m:t>
           </m:r>
         </m:oMath>
       </m:oMathPara>
@@ -1319,13 +1252,7 @@
                 <w:rPr>
                   <w:rFonts w:ascii="Cambria Math" w:hAnsi="Cambria Math"/>
                 </w:rPr>
-                <m:t>38.</m:t>
-              </m:r>
-              <m:r>
-                <w:rPr>
-                  <w:rFonts w:ascii="Cambria Math" w:hAnsi="Cambria Math"/>
-                </w:rPr>
-                <m:t>2</m:t>
+                <m:t>38.2</m:t>
               </m:r>
             </m:num>
             <m:den>
@@ -1341,19 +1268,7 @@
             <w:rPr>
               <w:rFonts w:ascii="Cambria Math" w:hAnsi="Cambria Math"/>
             </w:rPr>
-            <m:t>=6.</m:t>
-          </m:r>
-          <m:r>
-            <w:rPr>
-              <w:rFonts w:ascii="Cambria Math" w:hAnsi="Cambria Math"/>
-            </w:rPr>
-            <m:t>3</m:t>
-          </m:r>
-          <m:r>
-            <w:rPr>
-              <w:rFonts w:ascii="Cambria Math" w:hAnsi="Cambria Math"/>
-            </w:rPr>
-            <m:t>7</m:t>
+            <m:t>=6.37</m:t>
           </m:r>
         </m:oMath>
       </m:oMathPara>
@@ -1368,7 +1283,6 @@
         <w:rPr>
           <w:rFonts w:eastAsiaTheme="minorEastAsia"/>
         </w:rPr>
-        <w:lastRenderedPageBreak/>
         <w:t xml:space="preserve">Rounding up to ensure adequate capacity, </w:t>
       </w:r>
       <m:oMath>
@@ -1422,21 +1336,22 @@
         <w:t>Series Configuration (</w:t>
       </w:r>
       <m:oMath>
+        <m:r>
+          <w:rPr>
+            <w:rFonts w:ascii="Cambria Math" w:eastAsiaTheme="minorEastAsia" w:hAnsi="Cambria Math"/>
+          </w:rPr>
+          <m:t>\mathbit</m:t>
+        </m:r>
         <m:sSub>
           <m:sSubPr>
             <m:ctrlPr>
               <w:rPr>
                 <w:rFonts w:ascii="Cambria Math" w:eastAsiaTheme="minorEastAsia" w:hAnsi="Cambria Math"/>
-                <w:b/>
-                <w:bCs/>
               </w:rPr>
             </m:ctrlPr>
           </m:sSubPr>
           <m:e>
             <m:r>
-              <m:rPr>
-                <m:sty m:val="bi"/>
-              </m:rPr>
               <w:rPr>
                 <w:rFonts w:ascii="Cambria Math" w:eastAsiaTheme="minorEastAsia" w:hAnsi="Cambria Math"/>
               </w:rPr>
@@ -1445,16 +1360,19 @@
           </m:e>
           <m:sub>
             <m:r>
-              <m:rPr>
-                <m:sty m:val="bi"/>
-              </m:rPr>
               <w:rPr>
                 <w:rFonts w:ascii="Cambria Math" w:eastAsiaTheme="minorEastAsia" w:hAnsi="Cambria Math"/>
               </w:rPr>
-              <m:t>s</m:t>
+              <m:t>\mathbit</m:t>
             </m:r>
           </m:sub>
         </m:sSub>
+        <m:r>
+          <w:rPr>
+            <w:rFonts w:ascii="Cambria Math" w:eastAsiaTheme="minorEastAsia" w:hAnsi="Cambria Math"/>
+          </w:rPr>
+          <m:t>s</m:t>
+        </m:r>
       </m:oMath>
       <w:r>
         <w:rPr>
@@ -1494,7 +1412,6 @@
               <m:ctrlPr>
                 <w:rPr>
                   <w:rFonts w:ascii="Cambria Math" w:hAnsi="Cambria Math"/>
-                  <w:i/>
                 </w:rPr>
               </m:ctrlPr>
             </m:sSubPr>
@@ -1511,8 +1428,25 @@
                 <w:rPr>
                   <w:rFonts w:ascii="Cambria Math" w:hAnsi="Cambria Math"/>
                 </w:rPr>
-                <m:t>s (base)</m:t>
+                <m:t>s </m:t>
               </m:r>
+              <m:d>
+                <m:dPr>
+                  <m:ctrlPr>
+                    <w:rPr>
+                      <w:rFonts w:ascii="Cambria Math" w:hAnsi="Cambria Math"/>
+                    </w:rPr>
+                  </m:ctrlPr>
+                </m:dPr>
+                <m:e>
+                  <m:r>
+                    <w:rPr>
+                      <w:rFonts w:ascii="Cambria Math" w:hAnsi="Cambria Math"/>
+                    </w:rPr>
+                    <m:t>base</m:t>
+                  </m:r>
+                </m:e>
+              </m:d>
             </m:sub>
           </m:sSub>
           <m:r>
@@ -1526,7 +1460,6 @@
               <m:ctrlPr>
                 <w:rPr>
                   <w:rFonts w:ascii="Cambria Math" w:hAnsi="Cambria Math"/>
-                  <w:i/>
                 </w:rPr>
               </m:ctrlPr>
             </m:fPr>
@@ -1665,31 +1598,7 @@
                   <w:rPr>
                     <w:rFonts w:ascii="Cambria Math" w:hAnsi="Cambria Math"/>
                   </w:rPr>
-                  <m:t>16×3.2</m:t>
-                </m:r>
-                <m:r>
-                  <m:rPr>
-                    <m:nor/>
-                  </m:rPr>
-                  <w:rPr>
-                    <w:rFonts w:ascii="Cambria Math" w:hAnsi="Cambria Math"/>
-                  </w:rPr>
-                  <m:t> V</m:t>
-                </m:r>
-                <m:r>
-                  <w:rPr>
-                    <w:rFonts w:ascii="Cambria Math" w:hAnsi="Cambria Math"/>
-                  </w:rPr>
-                  <m:t>=51.2</m:t>
-                </m:r>
-                <m:r>
-                  <m:rPr>
-                    <m:nor/>
-                  </m:rPr>
-                  <w:rPr>
-                    <w:rFonts w:ascii="Cambria Math" w:hAnsi="Cambria Math"/>
-                  </w:rPr>
-                  <m:t> V</m:t>
+                  <m:t>16×3.2 V=51.2 V</m:t>
                 </m:r>
               </m:oMath>
             </m:oMathPara>
@@ -1724,33 +1633,7 @@
                 <w:rPr>
                   <w:rFonts w:ascii="Cambria Math" w:hAnsi="Cambria Math"/>
                 </w:rPr>
-                <m:t>7×6</m:t>
-              </m:r>
-              <m:r>
-                <m:rPr>
-                  <m:nor/>
-                </m:rPr>
-                <w:rPr>
-                  <w:rFonts w:ascii="Cambria Math" w:hAnsi="Cambria Math"/>
-                  <w:i/>
-                </w:rPr>
-                <m:t> Ah</m:t>
-              </m:r>
-              <m:r>
-                <w:rPr>
-                  <w:rFonts w:ascii="Cambria Math" w:hAnsi="Cambria Math"/>
-                </w:rPr>
-                <m:t>=42</m:t>
-              </m:r>
-              <m:r>
-                <m:rPr>
-                  <m:nor/>
-                </m:rPr>
-                <w:rPr>
-                  <w:rFonts w:ascii="Cambria Math" w:hAnsi="Cambria Math"/>
-                  <w:i/>
-                </w:rPr>
-                <m:t> Ah</m:t>
+                <m:t>7×6 Ah=42 Ah</m:t>
               </m:r>
             </m:oMath>
             <w:r>
@@ -1765,17 +1648,7 @@
                 <w:rPr>
                   <w:rFonts w:ascii="Cambria Math" w:hAnsi="Cambria Math"/>
                 </w:rPr>
-                <m:t>≈2150</m:t>
-              </m:r>
-              <m:r>
-                <m:rPr>
-                  <m:nor/>
-                </m:rPr>
-                <w:rPr>
-                  <w:rFonts w:ascii="Cambria Math" w:hAnsi="Cambria Math"/>
-                  <w:i/>
-                </w:rPr>
-                <m:t> Wh</m:t>
+                <m:t>≈2150 Wh</m:t>
               </m:r>
             </m:oMath>
             <w:r>
@@ -1813,31 +1686,7 @@
                   <w:rPr>
                     <w:rFonts w:ascii="Cambria Math" w:hAnsi="Cambria Math"/>
                   </w:rPr>
-                  <m:t>7×18</m:t>
-                </m:r>
-                <m:r>
-                  <m:rPr>
-                    <m:nor/>
-                  </m:rPr>
-                  <w:rPr>
-                    <w:rFonts w:ascii="Cambria Math" w:hAnsi="Cambria Math"/>
-                  </w:rPr>
-                  <m:t> A</m:t>
-                </m:r>
-                <m:r>
-                  <w:rPr>
-                    <w:rFonts w:ascii="Cambria Math" w:hAnsi="Cambria Math"/>
-                  </w:rPr>
-                  <m:t>=126</m:t>
-                </m:r>
-                <m:r>
-                  <m:rPr>
-                    <m:nor/>
-                  </m:rPr>
-                  <w:rPr>
-                    <w:rFonts w:ascii="Cambria Math" w:hAnsi="Cambria Math"/>
-                  </w:rPr>
-                  <m:t> A</m:t>
+                  <m:t>7×18 A=126 A</m:t>
                 </m:r>
               </m:oMath>
             </m:oMathPara>
@@ -1894,6 +1743,10 @@
               <w:jc w:val="center"/>
             </w:pPr>
             <w:r>
+              <w:rPr>
+                <w:noProof/>
+              </w:rPr>
+              <w:lastRenderedPageBreak/>
               <w:drawing>
                 <wp:inline distT="0" distB="0" distL="0" distR="0" wp14:anchorId="10F31F04" wp14:editId="22A50C32">
                   <wp:extent cx="2701392" cy="3174000"/>
@@ -1947,6 +1800,9 @@
               <w:jc w:val="center"/>
             </w:pPr>
             <w:r>
+              <w:rPr>
+                <w:noProof/>
+              </w:rPr>
               <w:drawing>
                 <wp:inline distT="0" distB="0" distL="0" distR="0" wp14:anchorId="301701B8" wp14:editId="4A667F24">
                   <wp:extent cx="2320972" cy="3140138"/>
@@ -2005,7 +1861,6 @@
           <w:b/>
           <w:bCs/>
         </w:rPr>
-        <w:lastRenderedPageBreak/>
         <w:t>Battery Management System (BMS):</w:t>
       </w:r>
     </w:p>
@@ -2065,19 +1920,7 @@
           <w:rPr>
             <w:rFonts w:ascii="Cambria Math" w:hAnsi="Cambria Math"/>
           </w:rPr>
-          <m:t>≈1</m:t>
-        </m:r>
-        <m:r>
-          <w:rPr>
-            <w:rFonts w:ascii="Cambria Math" w:hAnsi="Cambria Math"/>
-          </w:rPr>
-          <m:t>8</m:t>
-        </m:r>
-        <m:r>
-          <m:rPr>
-            <m:nor/>
-          </m:rPr>
-          <m:t> A</m:t>
+          <m:t>≈18 A</m:t>
         </m:r>
       </m:oMath>
       <w:r>
@@ -2122,6 +1965,10 @@
               <w:jc w:val="center"/>
             </w:pPr>
             <w:r>
+              <w:rPr>
+                <w:noProof/>
+              </w:rPr>
+              <w:lastRenderedPageBreak/>
               <w:drawing>
                 <wp:inline distT="0" distB="0" distL="0" distR="0" wp14:anchorId="5DD02F76" wp14:editId="72E7B8DA">
                   <wp:extent cx="3650776" cy="2772406"/>

</xml_diff>